<commit_message>
Fix Template Daftar Hadir
</commit_message>
<xml_diff>
--- a/public/templates/1. Daftar Hadir Pelatihan SE2026.docx
+++ b/public/templates/1. Daftar Hadir Pelatihan SE2026.docx
@@ -218,7 +218,7 @@
     <w:tbl>
       <w:tblPr>
         <w:tblStyle w:val="a0"/>
-        <w:tblW w:w="10773" w:type="dxa"/>
+        <w:tblW w:w="10770" w:type="dxa"/>
         <w:tblInd w:w="-1139" w:type="dxa"/>
         <w:tblBorders>
           <w:top w:val="single" w:sz="4" w:space="0" w:color="000000"/>
@@ -232,19 +232,19 @@
         <w:tblLook w:val="0000" w:firstRow="0" w:lastRow="0" w:firstColumn="0" w:lastColumn="0" w:noHBand="0" w:noVBand="0"/>
       </w:tblPr>
       <w:tblGrid>
-        <w:gridCol w:w="584"/>
-        <w:gridCol w:w="2863"/>
-        <w:gridCol w:w="2654"/>
-        <w:gridCol w:w="2654"/>
-        <w:gridCol w:w="2018"/>
+        <w:gridCol w:w="2154"/>
+        <w:gridCol w:w="2154"/>
+        <w:gridCol w:w="2154"/>
+        <w:gridCol w:w="2154"/>
+        <w:gridCol w:w="2154"/>
       </w:tblGrid>
       <w:tr>
         <w:trPr>
-          <w:trHeight w:val="851"/>
+          <w:trHeight w:val="20"/>
         </w:trPr>
         <w:tc>
           <w:tcPr>
-            <w:tcW w:w="584" w:type="dxa"/>
+            <w:tcW w:w="2154" w:type="dxa"/>
             <w:shd w:val="clear" w:color="auto" w:fill="CCCCCC"/>
             <w:vAlign w:val="center"/>
           </w:tcPr>
@@ -265,7 +265,7 @@
         </w:tc>
         <w:tc>
           <w:tcPr>
-            <w:tcW w:w="2863" w:type="dxa"/>
+            <w:tcW w:w="2154" w:type="dxa"/>
             <w:shd w:val="clear" w:color="auto" w:fill="CCCCCC"/>
             <w:vAlign w:val="center"/>
           </w:tcPr>
@@ -286,7 +286,7 @@
         </w:tc>
         <w:tc>
           <w:tcPr>
-            <w:tcW w:w="2654" w:type="dxa"/>
+            <w:tcW w:w="2154" w:type="dxa"/>
             <w:shd w:val="clear" w:color="auto" w:fill="CCCCCC"/>
             <w:vAlign w:val="center"/>
           </w:tcPr>
@@ -311,7 +311,7 @@
         </w:tc>
         <w:tc>
           <w:tcPr>
-            <w:tcW w:w="2654" w:type="dxa"/>
+            <w:tcW w:w="2154" w:type="dxa"/>
             <w:shd w:val="clear" w:color="auto" w:fill="CCCCCC"/>
             <w:vAlign w:val="center"/>
           </w:tcPr>
@@ -332,7 +332,7 @@
         </w:tc>
         <w:tc>
           <w:tcPr>
-            <w:tcW w:w="2018" w:type="dxa"/>
+            <w:tcW w:w="2154" w:type="dxa"/>
             <w:shd w:val="clear" w:color="auto" w:fill="CCCCCC"/>
             <w:vAlign w:val="center"/>
           </w:tcPr>
@@ -354,11 +354,11 @@
       </w:tr>
       <w:tr>
         <w:trPr>
-          <w:trHeight w:val="851"/>
+          <w:trHeight w:val="20"/>
         </w:trPr>
         <w:tc>
           <w:tcPr>
-            <w:tcW w:w="584" w:type="dxa"/>
+            <w:tcW w:w="2154" w:type="dxa"/>
             <w:vAlign w:val="center"/>
           </w:tcPr>
           <w:p>
@@ -394,7 +394,7 @@
         </w:tc>
         <w:tc>
           <w:tcPr>
-            <w:tcW w:w="2863" w:type="dxa"/>
+            <w:tcW w:w="2154" w:type="dxa"/>
           </w:tcPr>
           <w:p>
             <w:pPr>
@@ -408,7 +408,7 @@
         </w:tc>
         <w:tc>
           <w:tcPr>
-            <w:tcW w:w="2654" w:type="dxa"/>
+            <w:tcW w:w="2154" w:type="dxa"/>
           </w:tcPr>
           <w:p>
             <w:pPr>
@@ -430,7 +430,7 @@
         </w:tc>
         <w:tc>
           <w:tcPr>
-            <w:tcW w:w="2654" w:type="dxa"/>
+            <w:tcW w:w="2154" w:type="dxa"/>
           </w:tcPr>
           <w:p>
             <w:pPr>
@@ -452,7 +452,7 @@
         </w:tc>
         <w:tc>
           <w:tcPr>
-            <w:tcW w:w="2018" w:type="dxa"/>
+            <w:tcW w:w="2154" w:type="dxa"/>
           </w:tcPr>
           <w:p>
             <w:pPr>
@@ -504,7 +504,7 @@
     </w:p>
     <w:tbl>
       <w:tblPr>
-        <w:tblStyle w:val="KisiTabel"/>
+        <w:tblStyle w:val="TableGrid"/>
         <w:tblW w:w="0" w:type="auto"/>
         <w:tblInd w:w="5395" w:type="dxa"/>
         <w:tblBorders>
@@ -1060,7 +1060,7 @@
     <w:name w:val="Normal"/>
     <w:qFormat/>
   </w:style>
-  <w:style w:type="paragraph" w:styleId="Judul1">
+  <w:style w:type="paragraph" w:styleId="Heading1">
     <w:name w:val="heading 1"/>
     <w:basedOn w:val="Normal"/>
     <w:next w:val="Normal"/>
@@ -1079,7 +1079,7 @@
       <w:szCs w:val="48"/>
     </w:rPr>
   </w:style>
-  <w:style w:type="paragraph" w:styleId="Judul2">
+  <w:style w:type="paragraph" w:styleId="Heading2">
     <w:name w:val="heading 2"/>
     <w:basedOn w:val="Normal"/>
     <w:next w:val="Normal"/>
@@ -1100,7 +1100,7 @@
       <w:szCs w:val="36"/>
     </w:rPr>
   </w:style>
-  <w:style w:type="paragraph" w:styleId="Judul3">
+  <w:style w:type="paragraph" w:styleId="Heading3">
     <w:name w:val="heading 3"/>
     <w:basedOn w:val="Normal"/>
     <w:next w:val="Normal"/>
@@ -1121,7 +1121,7 @@
       <w:szCs w:val="28"/>
     </w:rPr>
   </w:style>
-  <w:style w:type="paragraph" w:styleId="Judul4">
+  <w:style w:type="paragraph" w:styleId="Heading4">
     <w:name w:val="heading 4"/>
     <w:basedOn w:val="Normal"/>
     <w:next w:val="Normal"/>
@@ -1140,7 +1140,7 @@
       <w:bCs/>
     </w:rPr>
   </w:style>
-  <w:style w:type="paragraph" w:styleId="Judul5">
+  <w:style w:type="paragraph" w:styleId="Heading5">
     <w:name w:val="heading 5"/>
     <w:basedOn w:val="Normal"/>
     <w:next w:val="Normal"/>
@@ -1161,7 +1161,7 @@
       <w:szCs w:val="22"/>
     </w:rPr>
   </w:style>
-  <w:style w:type="paragraph" w:styleId="Judul6">
+  <w:style w:type="paragraph" w:styleId="Heading6">
     <w:name w:val="heading 6"/>
     <w:basedOn w:val="Normal"/>
     <w:next w:val="Normal"/>
@@ -1182,13 +1182,13 @@
       <w:szCs w:val="20"/>
     </w:rPr>
   </w:style>
-  <w:style w:type="character" w:default="1" w:styleId="FontParagrafDefault">
+  <w:style w:type="character" w:default="1" w:styleId="DefaultParagraphFont">
     <w:name w:val="Default Paragraph Font"/>
     <w:uiPriority w:val="1"/>
     <w:semiHidden/>
     <w:unhideWhenUsed/>
   </w:style>
-  <w:style w:type="table" w:default="1" w:styleId="TabelNormal">
+  <w:style w:type="table" w:default="1" w:styleId="TableNormal">
     <w:name w:val="Normal Table"/>
     <w:uiPriority w:val="99"/>
     <w:semiHidden/>
@@ -1203,13 +1203,13 @@
       </w:tblCellMar>
     </w:tblPr>
   </w:style>
-  <w:style w:type="numbering" w:default="1" w:styleId="TidakAdaDaftar">
+  <w:style w:type="numbering" w:default="1" w:styleId="NoList">
     <w:name w:val="No List"/>
     <w:uiPriority w:val="99"/>
     <w:semiHidden/>
     <w:unhideWhenUsed/>
   </w:style>
-  <w:style w:type="table" w:customStyle="1" w:styleId="TableNormal">
+  <w:style w:type="table" w:customStyle="1" w:styleId="TableNormal0">
     <w:name w:val="TableNormal"/>
     <w:tblPr>
       <w:tblCellMar>
@@ -1220,7 +1220,7 @@
       </w:tblCellMar>
     </w:tblPr>
   </w:style>
-  <w:style w:type="paragraph" w:styleId="Judul">
+  <w:style w:type="paragraph" w:styleId="Title">
     <w:name w:val="Title"/>
     <w:basedOn w:val="Normal"/>
     <w:next w:val="Normal"/>
@@ -1238,9 +1238,9 @@
       <w:szCs w:val="72"/>
     </w:rPr>
   </w:style>
-  <w:style w:type="table" w:styleId="KisiTabel">
+  <w:style w:type="table" w:styleId="TableGrid">
     <w:name w:val="Table Grid"/>
-    <w:basedOn w:val="TabelNormal"/>
+    <w:basedOn w:val="TableNormal"/>
     <w:pPr>
       <w:suppressAutoHyphens/>
       <w:spacing w:line="1" w:lineRule="atLeast"/>
@@ -1276,7 +1276,7 @@
       <w:em w:val="none"/>
     </w:rPr>
   </w:style>
-  <w:style w:type="paragraph" w:styleId="TeksBalon">
+  <w:style w:type="paragraph" w:styleId="BalloonText">
     <w:name w:val="Balloon Text"/>
     <w:basedOn w:val="Normal"/>
     <w:rPr>
@@ -1301,13 +1301,13 @@
     </w:rPr>
   </w:style>
   <w:style w:type="table" w:customStyle="1" w:styleId="a">
-    <w:basedOn w:val="TabelNormal"/>
+    <w:basedOn w:val="TableNormal"/>
     <w:tblPr>
       <w:tblStyleRowBandSize w:val="1"/>
       <w:tblStyleColBandSize w:val="1"/>
     </w:tblPr>
   </w:style>
-  <w:style w:type="paragraph" w:styleId="TidakAdaSpasi">
+  <w:style w:type="paragraph" w:styleId="NoSpacing">
     <w:name w:val="No Spacing"/>
     <w:uiPriority w:val="1"/>
     <w:qFormat/>
@@ -1324,9 +1324,9 @@
       <w:lang w:val="en-US"/>
     </w:rPr>
   </w:style>
-  <w:style w:type="character" w:styleId="ReferensiKomentar">
+  <w:style w:type="character" w:styleId="CommentReference">
     <w:name w:val="annotation reference"/>
-    <w:basedOn w:val="FontParagrafDefault"/>
+    <w:basedOn w:val="DefaultParagraphFont"/>
     <w:uiPriority w:val="99"/>
     <w:semiHidden/>
     <w:unhideWhenUsed/>
@@ -1336,10 +1336,10 @@
       <w:szCs w:val="16"/>
     </w:rPr>
   </w:style>
-  <w:style w:type="paragraph" w:styleId="TeksKomentar">
+  <w:style w:type="paragraph" w:styleId="CommentText">
     <w:name w:val="annotation text"/>
     <w:basedOn w:val="Normal"/>
-    <w:link w:val="TeksKomentarKAR"/>
+    <w:link w:val="CommentTextChar"/>
     <w:uiPriority w:val="99"/>
     <w:semiHidden/>
     <w:unhideWhenUsed/>
@@ -1349,10 +1349,10 @@
       <w:szCs w:val="20"/>
     </w:rPr>
   </w:style>
-  <w:style w:type="character" w:customStyle="1" w:styleId="TeksKomentarKAR">
-    <w:name w:val="Teks Komentar KAR"/>
-    <w:basedOn w:val="FontParagrafDefault"/>
-    <w:link w:val="TeksKomentar"/>
+  <w:style w:type="character" w:customStyle="1" w:styleId="CommentTextChar">
+    <w:name w:val="Comment Text Char"/>
+    <w:basedOn w:val="DefaultParagraphFont"/>
+    <w:link w:val="CommentText"/>
     <w:uiPriority w:val="99"/>
     <w:semiHidden/>
     <w:rsid w:val="00B0222C"/>
@@ -1363,11 +1363,11 @@
       <w:lang w:val="en-US"/>
     </w:rPr>
   </w:style>
-  <w:style w:type="paragraph" w:styleId="SubjekKomentar">
+  <w:style w:type="paragraph" w:styleId="CommentSubject">
     <w:name w:val="annotation subject"/>
-    <w:basedOn w:val="TeksKomentar"/>
-    <w:next w:val="TeksKomentar"/>
-    <w:link w:val="SubjekKomentarKAR"/>
+    <w:basedOn w:val="CommentText"/>
+    <w:next w:val="CommentText"/>
+    <w:link w:val="CommentSubjectChar"/>
     <w:uiPriority w:val="99"/>
     <w:semiHidden/>
     <w:unhideWhenUsed/>
@@ -1377,10 +1377,10 @@
       <w:bCs/>
     </w:rPr>
   </w:style>
-  <w:style w:type="character" w:customStyle="1" w:styleId="SubjekKomentarKAR">
-    <w:name w:val="Subjek Komentar KAR"/>
-    <w:basedOn w:val="TeksKomentarKAR"/>
-    <w:link w:val="SubjekKomentar"/>
+  <w:style w:type="character" w:customStyle="1" w:styleId="CommentSubjectChar">
+    <w:name w:val="Comment Subject Char"/>
+    <w:basedOn w:val="CommentTextChar"/>
+    <w:link w:val="CommentSubject"/>
     <w:uiPriority w:val="99"/>
     <w:semiHidden/>
     <w:rsid w:val="00B0222C"/>
@@ -1393,7 +1393,7 @@
       <w:lang w:val="en-US"/>
     </w:rPr>
   </w:style>
-  <w:style w:type="paragraph" w:styleId="Subjudul">
+  <w:style w:type="paragraph" w:styleId="Subtitle">
     <w:name w:val="Subtitle"/>
     <w:basedOn w:val="Normal"/>
     <w:next w:val="Normal"/>
@@ -1414,7 +1414,7 @@
     </w:rPr>
   </w:style>
   <w:style w:type="table" w:customStyle="1" w:styleId="a0">
-    <w:basedOn w:val="TabelNormal"/>
+    <w:basedOn w:val="TableNormal"/>
     <w:tblPr>
       <w:tblStyleRowBandSize w:val="1"/>
       <w:tblStyleColBandSize w:val="1"/>

</xml_diff>

<commit_message>
Fix Template Daftar Hadir v2
</commit_message>
<xml_diff>
--- a/public/templates/1. Daftar Hadir Pelatihan SE2026.docx
+++ b/public/templates/1. Daftar Hadir Pelatihan SE2026.docx
@@ -232,8 +232,8 @@
         <w:tblLook w:val="0000" w:firstRow="0" w:lastRow="0" w:firstColumn="0" w:lastColumn="0" w:noHBand="0" w:noVBand="0"/>
       </w:tblPr>
       <w:tblGrid>
-        <w:gridCol w:w="2154"/>
-        <w:gridCol w:w="2154"/>
+        <w:gridCol w:w="850"/>
+        <w:gridCol w:w="3458"/>
         <w:gridCol w:w="2154"/>
         <w:gridCol w:w="2154"/>
         <w:gridCol w:w="2154"/>
@@ -242,6 +242,48 @@
         <w:trPr>
           <w:trHeight w:val="20"/>
         </w:trPr>
+        <w:tc>
+          <w:tcPr>
+            <w:tcW w:w="850" w:type="dxa"/>
+            <w:shd w:val="clear" w:color="auto" w:fill="CCCCCC"/>
+            <w:vAlign w:val="center"/>
+          </w:tcPr>
+          <w:p>
+            <w:pPr>
+              <w:spacing w:before="80" w:after="80"/>
+              <w:ind w:hanging="2"/>
+              <w:jc w:val="center"/>
+            </w:pPr>
+            <w:r>
+              <w:rPr>
+                <w:b/>
+                <w:bCs/>
+              </w:rPr>
+              <w:t>NO</w:t>
+            </w:r>
+          </w:p>
+        </w:tc>
+        <w:tc>
+          <w:tcPr>
+            <w:tcW w:w="3458" w:type="dxa"/>
+            <w:shd w:val="clear" w:color="auto" w:fill="CCCCCC"/>
+            <w:vAlign w:val="center"/>
+          </w:tcPr>
+          <w:p>
+            <w:pPr>
+              <w:spacing w:before="80" w:after="80"/>
+              <w:ind w:hanging="2"/>
+              <w:jc w:val="center"/>
+            </w:pPr>
+            <w:r>
+              <w:rPr>
+                <w:b/>
+                <w:bCs/>
+              </w:rPr>
+              <w:t>NAMA</w:t>
+            </w:r>
+          </w:p>
+        </w:tc>
         <w:tc>
           <w:tcPr>
             <w:tcW w:w="2154" w:type="dxa"/>
@@ -253,13 +295,17 @@
               <w:spacing w:before="80" w:after="80"/>
               <w:ind w:hanging="2"/>
               <w:jc w:val="center"/>
-            </w:pPr>
-            <w:r>
               <w:rPr>
                 <w:b/>
                 <w:bCs/>
               </w:rPr>
-              <w:t>NO</w:t>
+            </w:pPr>
+            <w:r>
+              <w:rPr>
+                <w:b/>
+                <w:bCs/>
+              </w:rPr>
+              <w:t>JABATAN</w:t>
             </w:r>
           </w:p>
         </w:tc>
@@ -280,32 +326,7 @@
                 <w:b/>
                 <w:bCs/>
               </w:rPr>
-              <w:t>NAMA</w:t>
-            </w:r>
-          </w:p>
-        </w:tc>
-        <w:tc>
-          <w:tcPr>
-            <w:tcW w:w="2154" w:type="dxa"/>
-            <w:shd w:val="clear" w:color="auto" w:fill="CCCCCC"/>
-            <w:vAlign w:val="center"/>
-          </w:tcPr>
-          <w:p>
-            <w:pPr>
-              <w:spacing w:before="80" w:after="80"/>
-              <w:ind w:hanging="2"/>
-              <w:jc w:val="center"/>
-              <w:rPr>
-                <w:b/>
-                <w:bCs/>
-              </w:rPr>
-            </w:pPr>
-            <w:r>
-              <w:rPr>
-                <w:b/>
-                <w:bCs/>
-              </w:rPr>
-              <w:t>JABATAN</w:t>
+              <w:t>WILAYAH TUGAS</w:t>
             </w:r>
           </w:p>
         </w:tc>
@@ -326,27 +347,6 @@
                 <w:b/>
                 <w:bCs/>
               </w:rPr>
-              <w:t>WILAYAH TUGAS</w:t>
-            </w:r>
-          </w:p>
-        </w:tc>
-        <w:tc>
-          <w:tcPr>
-            <w:tcW w:w="2154" w:type="dxa"/>
-            <w:shd w:val="clear" w:color="auto" w:fill="CCCCCC"/>
-            <w:vAlign w:val="center"/>
-          </w:tcPr>
-          <w:p>
-            <w:pPr>
-              <w:spacing w:before="80" w:after="80"/>
-              <w:ind w:hanging="2"/>
-              <w:jc w:val="center"/>
-            </w:pPr>
-            <w:r>
-              <w:rPr>
-                <w:b/>
-                <w:bCs/>
-              </w:rPr>
               <w:t>TANDA TANGAN</w:t>
             </w:r>
           </w:p>
@@ -358,7 +358,7 @@
         </w:trPr>
         <w:tc>
           <w:tcPr>
-            <w:tcW w:w="2154" w:type="dxa"/>
+            <w:tcW w:w="850" w:type="dxa"/>
             <w:vAlign w:val="center"/>
           </w:tcPr>
           <w:p>
@@ -394,7 +394,7 @@
         </w:tc>
         <w:tc>
           <w:tcPr>
-            <w:tcW w:w="2154" w:type="dxa"/>
+            <w:tcW w:w="3458" w:type="dxa"/>
           </w:tcPr>
           <w:p>
             <w:pPr>

</xml_diff>